<commit_message>
Agenda and example pdf of app
</commit_message>
<xml_diff>
--- a/InterviewCoach_Agenda.docx
+++ b/InterviewCoach_Agenda.docx
@@ -20,6 +20,15 @@
           <w:szCs w:val="18"/>
         </w:rPr>
       </w:pPr>
+      <w:r>
+        <w:rPr>
+          <w:b/>
+          <w:bCs/>
+          <w:sz w:val="18"/>
+          <w:szCs w:val="18"/>
+        </w:rPr>
+        <w:t xml:space="preserve"> </w:t>
+      </w:r>
     </w:p>
     <w:p>
       <w:pPr>
@@ -31,21 +40,24 @@
         <w:rPr>
           <w:b/>
           <w:bCs/>
+          <w:strike/>
         </w:rPr>
       </w:pPr>
       <w:r>
         <w:rPr>
           <w:b/>
           <w:bCs/>
+          <w:strike/>
         </w:rPr>
-        <w:t>Bulletproof</w:t>
+        <w:t xml:space="preserve">To make the model verify the </w:t>
       </w:r>
       <w:r>
         <w:rPr>
           <w:b/>
           <w:bCs/>
+          <w:strike/>
         </w:rPr>
-        <w:t xml:space="preserve"> prompts and behaviour:</w:t>
+        <w:t>prompts and behaviour:</w:t>
       </w:r>
     </w:p>
     <w:p>
@@ -97,6 +109,18 @@
       </w:pPr>
       <w:r>
         <w:t>qualifications required/preferred by the recruiter.</w:t>
+      </w:r>
+    </w:p>
+    <w:p>
+      <w:pPr>
+        <w:pStyle w:val="ListParagraph"/>
+        <w:numPr>
+          <w:ilvl w:val="1"/>
+          <w:numId w:val="5"/>
+        </w:numPr>
+      </w:pPr>
+      <w:r>
+        <w:t>This is t ensure the model responds only to good and legitimate job descriptions.</w:t>
       </w:r>
     </w:p>
     <w:p>
@@ -109,12 +133,14 @@
         <w:rPr>
           <w:b/>
           <w:bCs/>
+          <w:strike/>
         </w:rPr>
       </w:pPr>
       <w:r>
         <w:rPr>
           <w:b/>
           <w:bCs/>
+          <w:strike/>
         </w:rPr>
         <w:t>Fix</w:t>
       </w:r>
@@ -122,6 +148,7 @@
         <w:rPr>
           <w:b/>
           <w:bCs/>
+          <w:strike/>
         </w:rPr>
         <w:t xml:space="preserve"> Tips section:</w:t>
       </w:r>
@@ -168,21 +195,127 @@
         <w:rPr>
           <w:b/>
           <w:bCs/>
+          <w:strike/>
         </w:rPr>
+      </w:pPr>
+      <w:r>
+        <w:rPr>
+          <w:b/>
+          <w:bCs/>
+          <w:strike/>
+        </w:rPr>
+        <w:t>Fix</w:t>
+      </w:r>
+      <w:r>
+        <w:rPr>
+          <w:b/>
+          <w:bCs/>
+          <w:strike/>
+        </w:rPr>
+        <w:t xml:space="preserve"> History Section</w:t>
+      </w:r>
+      <w:r>
+        <w:rPr>
+          <w:b/>
+          <w:bCs/>
+          <w:strike/>
+        </w:rPr>
+        <w:t xml:space="preserve"> </w:t>
+      </w:r>
+      <w:r>
+        <w:rPr>
+          <w:b/>
+          <w:bCs/>
+          <w:strike/>
+        </w:rPr>
+        <w:t xml:space="preserve">(Plugin will be </w:t>
+      </w:r>
+      <w:r>
+        <w:rPr>
+          <w:b/>
+          <w:bCs/>
+          <w:strike/>
+        </w:rPr>
+        <w:t>required</w:t>
+      </w:r>
+      <w:r>
+        <w:rPr>
+          <w:b/>
+          <w:bCs/>
+          <w:strike/>
+        </w:rPr>
+        <w:t>):</w:t>
+      </w:r>
+    </w:p>
+    <w:p>
+      <w:pPr>
+        <w:pStyle w:val="ListParagraph"/>
+        <w:numPr>
+          <w:ilvl w:val="1"/>
+          <w:numId w:val="7"/>
+        </w:numPr>
+      </w:pPr>
+      <w:r>
+        <w:t xml:space="preserve">Option to download Analysis/ History/ Responses as a pdf </w:t>
+      </w:r>
+      <w:r>
+        <w:t>report.</w:t>
+      </w:r>
+    </w:p>
+    <w:p>
+      <w:pPr>
+        <w:pStyle w:val="ListParagraph"/>
+        <w:ind w:left="1440"/>
+      </w:pPr>
+      <w:r>
+        <w:t>This is s</w:t>
+      </w:r>
+      <w:r>
+        <w:t>o user can access as and when they like</w:t>
+      </w:r>
+      <w:r>
+        <w:t>.</w:t>
+      </w:r>
+    </w:p>
+    <w:p>
+      <w:pPr>
+        <w:pStyle w:val="ListParagraph"/>
+        <w:numPr>
+          <w:ilvl w:val="1"/>
+          <w:numId w:val="7"/>
+        </w:numPr>
+      </w:pPr>
+      <w:r>
+        <w:t>Remove History &amp; Progress Section</w:t>
+      </w:r>
+      <w:r>
+        <w:t xml:space="preserve"> </w:t>
+      </w:r>
+      <w:r>
+        <w:t>(Add a Download Option instead)</w:t>
+      </w:r>
+    </w:p>
+    <w:p>
+      <w:pPr>
+        <w:pStyle w:val="ListParagraph"/>
+        <w:numPr>
+          <w:ilvl w:val="0"/>
+          <w:numId w:val="3"/>
+        </w:numPr>
       </w:pPr>
       <w:r>
         <w:rPr>
           <w:b/>
           <w:bCs/>
         </w:rPr>
-        <w:t>Fix</w:t>
+        <w:t>Make</w:t>
       </w:r>
       <w:r>
         <w:rPr>
           <w:b/>
           <w:bCs/>
         </w:rPr>
-        <w:t xml:space="preserve"> History Section</w:t>
+        <w:t xml:space="preserve"> Response grading/analysis robust/</w:t>
       </w:r>
       <w:r>
         <w:rPr>
@@ -196,105 +329,6 @@
           <w:b/>
           <w:bCs/>
         </w:rPr>
-        <w:t xml:space="preserve">(Plugin will be </w:t>
-      </w:r>
-      <w:r>
-        <w:rPr>
-          <w:b/>
-          <w:bCs/>
-        </w:rPr>
-        <w:t>required</w:t>
-      </w:r>
-      <w:r>
-        <w:rPr>
-          <w:b/>
-          <w:bCs/>
-        </w:rPr>
-        <w:t>):</w:t>
-      </w:r>
-    </w:p>
-    <w:p>
-      <w:pPr>
-        <w:pStyle w:val="ListParagraph"/>
-        <w:numPr>
-          <w:ilvl w:val="1"/>
-          <w:numId w:val="7"/>
-        </w:numPr>
-      </w:pPr>
-      <w:r>
-        <w:t xml:space="preserve">Option to download Analysis/ History/ Responses as a pdf </w:t>
-      </w:r>
-      <w:r>
-        <w:t>report.</w:t>
-      </w:r>
-    </w:p>
-    <w:p>
-      <w:pPr>
-        <w:pStyle w:val="ListParagraph"/>
-        <w:ind w:left="1440"/>
-      </w:pPr>
-      <w:r>
-        <w:t>This is s</w:t>
-      </w:r>
-      <w:r>
-        <w:t>o user can access as and when they like</w:t>
-      </w:r>
-      <w:r>
-        <w:t>.</w:t>
-      </w:r>
-    </w:p>
-    <w:p>
-      <w:pPr>
-        <w:pStyle w:val="ListParagraph"/>
-        <w:numPr>
-          <w:ilvl w:val="1"/>
-          <w:numId w:val="7"/>
-        </w:numPr>
-      </w:pPr>
-      <w:r>
-        <w:t>Remove History &amp; Progress Section</w:t>
-      </w:r>
-      <w:r>
-        <w:t xml:space="preserve"> </w:t>
-      </w:r>
-      <w:r>
-        <w:t>(Add a Download Option instead)</w:t>
-      </w:r>
-    </w:p>
-    <w:p>
-      <w:pPr>
-        <w:pStyle w:val="ListParagraph"/>
-        <w:numPr>
-          <w:ilvl w:val="0"/>
-          <w:numId w:val="3"/>
-        </w:numPr>
-      </w:pPr>
-      <w:r>
-        <w:rPr>
-          <w:b/>
-          <w:bCs/>
-        </w:rPr>
-        <w:t>Make</w:t>
-      </w:r>
-      <w:r>
-        <w:rPr>
-          <w:b/>
-          <w:bCs/>
-        </w:rPr>
-        <w:t xml:space="preserve"> Response grading/analysis robust/</w:t>
-      </w:r>
-      <w:r>
-        <w:rPr>
-          <w:b/>
-          <w:bCs/>
-        </w:rPr>
-        <w:t xml:space="preserve"> </w:t>
-      </w:r>
-      <w:r>
-        <w:rPr>
-          <w:b/>
-          <w:bCs/>
-        </w:rPr>
         <w:t>flexible.</w:t>
       </w:r>
     </w:p>
@@ -330,9 +364,65 @@
     </w:p>
     <w:p>
       <w:pPr>
-        <w:pStyle w:val="TRTMakronDemoStyle"/>
-      </w:pPr>
+        <w:pStyle w:val="ListParagraph"/>
+        <w:ind w:left="360"/>
+        <w:rPr>
+          <w:strike/>
+        </w:rPr>
+      </w:pPr>
+      <w:r>
+        <w:rPr>
+          <w:b/>
+          <w:bCs/>
+        </w:rPr>
+        <w:t xml:space="preserve">5. </w:t>
+      </w:r>
+      <w:r>
+        <w:rPr>
+          <w:b/>
+          <w:bCs/>
+        </w:rPr>
+        <w:t xml:space="preserve">   </w:t>
+      </w:r>
+      <w:r>
+        <w:rPr>
+          <w:b/>
+          <w:bCs/>
+          <w:strike/>
+        </w:rPr>
+        <w:t>Add support for any type of job description, not only tech based like it is right now.</w:t>
+      </w:r>
     </w:p>
+    <w:p>
+      <w:pPr>
+        <w:pStyle w:val="ListParagraph"/>
+        <w:numPr>
+          <w:ilvl w:val="1"/>
+          <w:numId w:val="8"/>
+        </w:numPr>
+      </w:pPr>
+      <w:r>
+        <w:t>Make the model adapt and be flexible by scan</w:t>
+      </w:r>
+      <w:r>
+        <w:t>ning</w:t>
+      </w:r>
+      <w:r>
+        <w:t xml:space="preserve"> and understand</w:t>
+      </w:r>
+      <w:r>
+        <w:t>ing</w:t>
+      </w:r>
+      <w:r>
+        <w:t xml:space="preserve"> the field/industry the job description is of/from</w:t>
+      </w:r>
+      <w:r>
+        <w:t>.</w:t>
+      </w:r>
+    </w:p>
+    <w:p/>
+    <w:p/>
+    <w:p/>
     <w:sectPr>
       <w:pgSz w:w="11906" w:h="16838"/>
       <w:pgMar w:top="1440" w:right="1440" w:bottom="1440" w:left="1440" w:header="708" w:footer="708" w:gutter="0"/>

</xml_diff>